<commit_message>
chore(repo): prepara release pública, metadatos DOI y README en inglés
</commit_message>
<xml_diff>
--- a/title_page.docx
+++ b/title_page.docx
@@ -258,17 +258,17 @@
         <w:br/>
       </w:r>
       <w:r>
-        <w:t xml:space="preserve">Doble Ciego Anónimo (</w:t>
+        <w:t xml:space="preserve">Revisión de un solo anonimizado (</w:t>
       </w:r>
       <w:r>
         <w:rPr>
           <w:i/>
           <w:iCs/>
         </w:rPr>
-        <w:t xml:space="preserve">Double-Anonymous Peer Review</w:t>
-      </w:r>
-      <w:r>
-        <w:t xml:space="preserve">)</w:t>
+        <w:t xml:space="preserve">Single-Anonymized Peer Review</w:t>
+      </w:r>
+      <w:r>
+        <w:t xml:space="preserve">, política de C&amp;G)</w:t>
       </w:r>
     </w:p>
     <w:p>
@@ -1133,7 +1133,7 @@
         <w:t xml:space="preserve"> </w:t>
       </w:r>
       <w:r>
-        <w:t xml:space="preserve">Python 3.11+ / 3.12, DuckDB</w:t>
+        <w:t xml:space="preserve">Python 3.12+, DuckDB</w:t>
       </w:r>
       <w:r>
         <w:t xml:space="preserve"> </w:t>

</xml_diff>

<commit_message>
docs(release): agrega DOI de código y datos
</commit_message>
<xml_diff>
--- a/title_page.docx
+++ b/title_page.docx
@@ -996,7 +996,7 @@
     </w:p>
     <w:bookmarkEnd w:id="18"/>
     <w:bookmarkEnd w:id="19"/>
-    <w:bookmarkStart w:id="29" w:name="Xc3df9541fd9aa2ebc242b360f3fcbbede422e9d"/>
+    <w:bookmarkStart w:id="31" w:name="Xc3df9541fd9aa2ebc242b360f3fcbbede422e9d"/>
     <w:p>
       <w:pPr>
         <w:pStyle w:val="Heading1"/>
@@ -1005,7 +1005,7 @@
         <w:t xml:space="preserve">6. Declaraciones Obligatorias de Elsevier / Declarations</w:t>
       </w:r>
     </w:p>
-    <w:bookmarkStart w:id="21" w:name="X70f8decb7765084b7f9d2e73c83f15df9b20afc"/>
+    <w:bookmarkStart w:id="23" w:name="X70f8decb7765084b7f9d2e73c83f15df9b20afc"/>
     <w:p>
       <w:pPr>
         <w:pStyle w:val="Heading3"/>
@@ -1275,8 +1275,62 @@
         </w:r>
       </w:hyperlink>
     </w:p>
-    <w:bookmarkEnd w:id="21"/>
-    <w:bookmarkStart w:id="25" w:name="X2e6a9152266b96449fe18b3a1b6306101b90c46"/>
+    <w:p>
+      <w:pPr>
+        <w:pStyle w:val="Compact"/>
+        <w:numPr>
+          <w:ilvl w:val="0"/>
+          <w:numId w:val="1005"/>
+        </w:numPr>
+      </w:pPr>
+      <w:r>
+        <w:rPr>
+          <w:b/>
+          <w:bCs/>
+        </w:rPr>
+        <w:t xml:space="preserve">DOI del Código:</w:t>
+      </w:r>
+      <w:r>
+        <w:t xml:space="preserve"> </w:t>
+      </w:r>
+      <w:hyperlink r:id="rId21">
+        <w:r>
+          <w:rPr>
+            <w:rStyle w:val="Hyperlink"/>
+          </w:rPr>
+          <w:t xml:space="preserve">10.5281/zenodo.23675105</w:t>
+        </w:r>
+      </w:hyperlink>
+    </w:p>
+    <w:p>
+      <w:pPr>
+        <w:pStyle w:val="Compact"/>
+        <w:numPr>
+          <w:ilvl w:val="0"/>
+          <w:numId w:val="1005"/>
+        </w:numPr>
+      </w:pPr>
+      <w:r>
+        <w:rPr>
+          <w:b/>
+          <w:bCs/>
+        </w:rPr>
+        <w:t xml:space="preserve">DOI de los Datos:</w:t>
+      </w:r>
+      <w:r>
+        <w:t xml:space="preserve"> </w:t>
+      </w:r>
+      <w:hyperlink r:id="rId22">
+        <w:r>
+          <w:rPr>
+            <w:rStyle w:val="Hyperlink"/>
+          </w:rPr>
+          <w:t xml:space="preserve">10.5281/zenodo.23675279</w:t>
+        </w:r>
+      </w:hyperlink>
+    </w:p>
+    <w:bookmarkEnd w:id="23"/>
+    <w:bookmarkStart w:id="27" w:name="X2e6a9152266b96449fe18b3a1b6306101b90c46"/>
     <w:p>
       <w:pPr>
         <w:pStyle w:val="Heading3"/>
@@ -1317,7 +1371,7 @@
       <w:r>
         <w:t xml:space="preserve"> </w:t>
       </w:r>
-      <w:hyperlink r:id="rId22">
+      <w:hyperlink r:id="rId24">
         <w:r>
           <w:rPr>
             <w:rStyle w:val="Hyperlink"/>
@@ -1350,7 +1404,7 @@
       <w:r>
         <w:t xml:space="preserve">Copernicus Climate Data Store (CDS) ERA5-Land reanalysis (</w:t>
       </w:r>
-      <w:hyperlink r:id="rId23">
+      <w:hyperlink r:id="rId25">
         <w:r>
           <w:rPr>
             <w:rStyle w:val="Hyperlink"/>
@@ -1423,7 +1477,7 @@
       <w:r>
         <w:t xml:space="preserve">Marco geoBoundaries ADM0 y ADM1 (</w:t>
       </w:r>
-      <w:hyperlink r:id="rId24">
+      <w:hyperlink r:id="rId26">
         <w:r>
           <w:rPr>
             <w:rStyle w:val="Hyperlink"/>
@@ -1453,11 +1507,25 @@
         <w:t xml:space="preserve"> </w:t>
       </w:r>
       <w:r>
-        <w:t xml:space="preserve">y se archivan en Zenodo/OSF bajo licencia CC BY 4.0.</w:t>
-      </w:r>
-    </w:p>
-    <w:bookmarkEnd w:id="25"/>
-    <w:bookmarkStart w:id="26" w:name="c.-financiamiento-funding"/>
+        <w:t xml:space="preserve">y están archivados en Zenodo bajo licencia CC BY 4.0:</w:t>
+      </w:r>
+      <w:r>
+        <w:t xml:space="preserve"> </w:t>
+      </w:r>
+      <w:hyperlink r:id="rId22">
+        <w:r>
+          <w:rPr>
+            <w:rStyle w:val="Hyperlink"/>
+          </w:rPr>
+          <w:t xml:space="preserve">10.5281/zenodo.23675279</w:t>
+        </w:r>
+      </w:hyperlink>
+      <w:r>
+        <w:t xml:space="preserve">.</w:t>
+      </w:r>
+    </w:p>
+    <w:bookmarkEnd w:id="27"/>
+    <w:bookmarkStart w:id="28" w:name="c.-financiamiento-funding"/>
     <w:p>
       <w:pPr>
         <w:pStyle w:val="Heading3"/>
@@ -1474,8 +1542,8 @@
         <w:t xml:space="preserve">Esta investigación fue realizada como un desarrollo de investigación independiente y de acceso abierto autofinanciado por el autor. No se recibieron subvenciones específicas de organismos del sector público, comercial o sin fines de lucro.</w:t>
       </w:r>
     </w:p>
-    <w:bookmarkEnd w:id="26"/>
-    <w:bookmarkStart w:id="27" w:name="Xae657ab1a92bd8f09f57de06fc35a8d594aaeca"/>
+    <w:bookmarkEnd w:id="28"/>
+    <w:bookmarkStart w:id="29" w:name="Xae657ab1a92bd8f09f57de06fc35a8d594aaeca"/>
     <w:p>
       <w:pPr>
         <w:pStyle w:val="Heading3"/>
@@ -1492,8 +1560,8 @@
         <w:t xml:space="preserve">El autor declara que no existen conflictos de interés financieros, institucionales ni personales que hayan podido influir en el diseño, análisis, interpretación o presentación de los resultados expuestos en este manuscrito.</w:t>
       </w:r>
     </w:p>
-    <w:bookmarkEnd w:id="27"/>
-    <w:bookmarkStart w:id="28" w:name="X165867c682dba5cbdd9d30e774da206830c2fdb"/>
+    <w:bookmarkEnd w:id="29"/>
+    <w:bookmarkStart w:id="30" w:name="X165867c682dba5cbdd9d30e774da206830c2fdb"/>
     <w:p>
       <w:pPr>
         <w:pStyle w:val="Heading3"/>
@@ -1524,8 +1592,8 @@
         <w:t xml:space="preserve">Conceptualización, Metodología, Software, Validación, Análisis Formal, Investigación, Recursos, Curación de Datos, Redacción - Borrador Original, Redacción - Revisión y Edición, Visualización, Supervisión y Administración del Proyecto.</w:t>
       </w:r>
     </w:p>
-    <w:bookmarkEnd w:id="28"/>
-    <w:bookmarkEnd w:id="29"/>
+    <w:bookmarkEnd w:id="30"/>
+    <w:bookmarkEnd w:id="31"/>
     <w:sectPr>
       <w:footnotePr>
         <w:numRestart w:val="eachSect"/>

</xml_diff>

<commit_message>
feat(v3): integra contrato de features v3, desmonte Hansen, manuscritos en español y fix de compatibilidad de sintaxis en script 03
</commit_message>
<xml_diff>
--- a/title_page.docx
+++ b/title_page.docx
@@ -26,7 +26,7 @@
         <w:t xml:space="preserve">2026-10-24</w:t>
       </w:r>
     </w:p>
-    <w:bookmarkStart w:id="9" w:name="X91b8e933fbe09d3a75c28ccb4dc2bb04727a969"/>
+    <w:bookmarkStart w:id="11" w:name="X91b8e933fbe09d3a75c28ccb4dc2bb04727a969"/>
     <w:p>
       <w:pPr>
         <w:pStyle w:val="Heading1"/>
@@ -304,14 +304,68 @@
       </w:r>
     </w:p>
     <w:p>
+      <w:pPr>
+        <w:pStyle w:val="Compact"/>
+        <w:numPr>
+          <w:ilvl w:val="0"/>
+          <w:numId w:val="1001"/>
+        </w:numPr>
+      </w:pPr>
+      <w:r>
+        <w:rPr>
+          <w:b/>
+          <w:bCs/>
+        </w:rPr>
+        <w:t xml:space="preserve">Manuscrito en HTML / Manuscript in HTML:</w:t>
+      </w:r>
+      <w:r>
+        <w:br/>
+      </w:r>
+      <w:hyperlink r:id="rId9">
+        <w:r>
+          <w:rPr>
+            <w:rStyle w:val="Hyperlink"/>
+          </w:rPr>
+          <w:t xml:space="preserve">Abrir el manuscrito en HTML</w:t>
+        </w:r>
+      </w:hyperlink>
+    </w:p>
+    <w:p>
+      <w:pPr>
+        <w:pStyle w:val="Compact"/>
+        <w:numPr>
+          <w:ilvl w:val="0"/>
+          <w:numId w:val="1001"/>
+        </w:numPr>
+      </w:pPr>
+      <w:r>
+        <w:rPr>
+          <w:b/>
+          <w:bCs/>
+        </w:rPr>
+        <w:t xml:space="preserve">Material Suplementario en HTML / Supplementary Material in HTML:</w:t>
+      </w:r>
+      <w:r>
+        <w:br/>
+      </w:r>
+      <w:hyperlink r:id="rId10">
+        <w:r>
+          <w:rPr>
+            <w:rStyle w:val="Hyperlink"/>
+          </w:rPr>
+          <w:t xml:space="preserve">Abrir el material suplementario</w:t>
+        </w:r>
+      </w:hyperlink>
+    </w:p>
+    <w:p>
       <w:r>
         <w:pict>
           <v:rect style="width:0;height:1.5pt" o:hralign="center" o:hrstd="t" o:hr="t"/>
         </w:pict>
       </w:r>
     </w:p>
-    <w:bookmarkEnd w:id="9"/>
-    <w:bookmarkStart w:id="11" w:name="Xfb8a93190f39b9b145f294f58bd1a7ddd9c53de"/>
+    <w:bookmarkEnd w:id="11"/>
+    <w:bookmarkStart w:id="13" w:name="Xfb8a93190f39b9b145f294f58bd1a7ddd9c53de"/>
     <w:p>
       <w:pPr>
         <w:pStyle w:val="Heading1"/>
@@ -380,7 +434,7 @@
       <w:r>
         <w:t xml:space="preserve"> </w:t>
       </w:r>
-      <w:hyperlink r:id="rId10">
+      <w:hyperlink r:id="rId12">
         <w:r>
           <w:rPr>
             <w:rStyle w:val="Hyperlink"/>
@@ -449,8 +503,8 @@
         </w:pict>
       </w:r>
     </w:p>
-    <w:bookmarkEnd w:id="11"/>
-    <w:bookmarkStart w:id="12" w:name="X8ab1327f2b895b77afb78b769bce3bafbc6d551"/>
+    <w:bookmarkEnd w:id="13"/>
+    <w:bookmarkStart w:id="14" w:name="X8ab1327f2b895b77afb78b769bce3bafbc6d551"/>
     <w:p>
       <w:pPr>
         <w:pStyle w:val="Heading1"/>
@@ -588,8 +642,8 @@
         </w:pict>
       </w:r>
     </w:p>
-    <w:bookmarkEnd w:id="12"/>
-    <w:bookmarkStart w:id="16" w:name="resumen-gráfico-graphical-abstract"/>
+    <w:bookmarkEnd w:id="14"/>
+    <w:bookmarkStart w:id="18" w:name="resumen-gráfico-graphical-abstract"/>
     <w:p>
       <w:pPr>
         <w:pStyle w:val="Heading1"/>
@@ -607,18 +661,18 @@
           <wp:inline>
             <wp:extent cx="5334000" cy="2115349"/>
             <wp:effectExtent b="0" l="0" r="0" t="0"/>
-            <wp:docPr descr="" title="" id="14" name="Picture"/>
+            <wp:docPr descr="" title="" id="16" name="Picture"/>
             <a:graphic>
               <a:graphicData uri="http://schemas.openxmlformats.org/drawingml/2006/picture">
                 <pic:pic>
                   <pic:nvPicPr>
-                    <pic:cNvPr descr="figuras/graphical_abstract.png" id="15" name="Picture"/>
+                    <pic:cNvPr descr="figuras/graphical_abstract.png" id="17" name="Picture"/>
                     <pic:cNvPicPr>
                       <a:picLocks noChangeArrowheads="1" noChangeAspect="1"/>
                     </pic:cNvPicPr>
                   </pic:nvPicPr>
                   <pic:blipFill>
-                    <a:blip r:embed="rId13"/>
+                    <a:blip r:embed="rId15"/>
                     <a:stretch>
                       <a:fillRect/>
                     </a:stretch>
@@ -670,8 +724,8 @@
         </w:pict>
       </w:r>
     </w:p>
-    <w:bookmarkEnd w:id="16"/>
-    <w:bookmarkStart w:id="19" w:name="resumen-abstract-keywords"/>
+    <w:bookmarkEnd w:id="18"/>
+    <w:bookmarkStart w:id="21" w:name="resumen-abstract-keywords"/>
     <w:p>
       <w:pPr>
         <w:pStyle w:val="Heading1"/>
@@ -680,7 +734,7 @@
         <w:t xml:space="preserve">5. Resumen / Abstract &amp; Keywords</w:t>
       </w:r>
     </w:p>
-    <w:bookmarkStart w:id="17" w:name="resumen-español"/>
+    <w:bookmarkStart w:id="19" w:name="resumen-español"/>
     <w:p>
       <w:pPr>
         <w:pStyle w:val="Heading3"/>
@@ -963,8 +1017,8 @@
         </w:pict>
       </w:r>
     </w:p>
-    <w:bookmarkEnd w:id="17"/>
-    <w:bookmarkStart w:id="18" w:name="abstract-english"/>
+    <w:bookmarkEnd w:id="19"/>
+    <w:bookmarkStart w:id="20" w:name="abstract-english"/>
     <w:p>
       <w:pPr>
         <w:pStyle w:val="Heading3"/>
@@ -1006,9 +1060,9 @@
         </w:pict>
       </w:r>
     </w:p>
-    <w:bookmarkEnd w:id="18"/>
-    <w:bookmarkEnd w:id="19"/>
-    <w:bookmarkStart w:id="31" w:name="Xc3df9541fd9aa2ebc242b360f3fcbbede422e9d"/>
+    <w:bookmarkEnd w:id="20"/>
+    <w:bookmarkEnd w:id="21"/>
+    <w:bookmarkStart w:id="33" w:name="Xc3df9541fd9aa2ebc242b360f3fcbbede422e9d"/>
     <w:p>
       <w:pPr>
         <w:pStyle w:val="Heading1"/>
@@ -1017,7 +1071,7 @@
         <w:t xml:space="preserve">6. Declaraciones Obligatorias de Elsevier / Declarations</w:t>
       </w:r>
     </w:p>
-    <w:bookmarkStart w:id="23" w:name="X70f8decb7765084b7f9d2e73c83f15df9b20afc"/>
+    <w:bookmarkStart w:id="25" w:name="X70f8decb7765084b7f9d2e73c83f15df9b20afc"/>
     <w:p>
       <w:pPr>
         <w:pStyle w:val="Heading3"/>
@@ -1278,7 +1332,7 @@
       <w:r>
         <w:t xml:space="preserve"> </w:t>
       </w:r>
-      <w:hyperlink r:id="rId20">
+      <w:hyperlink r:id="rId22">
         <w:r>
           <w:rPr>
             <w:rStyle w:val="Hyperlink"/>
@@ -1305,7 +1359,7 @@
       <w:r>
         <w:t xml:space="preserve"> </w:t>
       </w:r>
-      <w:hyperlink r:id="rId21">
+      <w:hyperlink r:id="rId23">
         <w:r>
           <w:rPr>
             <w:rStyle w:val="Hyperlink"/>
@@ -1332,7 +1386,7 @@
       <w:r>
         <w:t xml:space="preserve"> </w:t>
       </w:r>
-      <w:hyperlink r:id="rId22">
+      <w:hyperlink r:id="rId24">
         <w:r>
           <w:rPr>
             <w:rStyle w:val="Hyperlink"/>
@@ -1341,8 +1395,8 @@
         </w:r>
       </w:hyperlink>
     </w:p>
-    <w:bookmarkEnd w:id="23"/>
-    <w:bookmarkStart w:id="27" w:name="X2e6a9152266b96449fe18b3a1b6306101b90c46"/>
+    <w:bookmarkEnd w:id="25"/>
+    <w:bookmarkStart w:id="29" w:name="X2e6a9152266b96449fe18b3a1b6306101b90c46"/>
     <w:p>
       <w:pPr>
         <w:pStyle w:val="Heading3"/>
@@ -1383,7 +1437,7 @@
       <w:r>
         <w:t xml:space="preserve"> </w:t>
       </w:r>
-      <w:hyperlink r:id="rId24">
+      <w:hyperlink r:id="rId26">
         <w:r>
           <w:rPr>
             <w:rStyle w:val="Hyperlink"/>
@@ -1416,7 +1470,7 @@
       <w:r>
         <w:t xml:space="preserve">Copernicus Climate Data Store (CDS) ERA5-Land reanalysis (</w:t>
       </w:r>
-      <w:hyperlink r:id="rId25">
+      <w:hyperlink r:id="rId27">
         <w:r>
           <w:rPr>
             <w:rStyle w:val="Hyperlink"/>
@@ -1489,7 +1543,7 @@
       <w:r>
         <w:t xml:space="preserve">Marco geoBoundaries ADM0 y ADM1 (</w:t>
       </w:r>
-      <w:hyperlink r:id="rId26">
+      <w:hyperlink r:id="rId28">
         <w:r>
           <w:rPr>
             <w:rStyle w:val="Hyperlink"/>
@@ -1524,7 +1578,7 @@
       <w:r>
         <w:t xml:space="preserve"> </w:t>
       </w:r>
-      <w:hyperlink r:id="rId22">
+      <w:hyperlink r:id="rId24">
         <w:r>
           <w:rPr>
             <w:rStyle w:val="Hyperlink"/>
@@ -1536,8 +1590,8 @@
         <w:t xml:space="preserve">.</w:t>
       </w:r>
     </w:p>
-    <w:bookmarkEnd w:id="27"/>
-    <w:bookmarkStart w:id="28" w:name="c.-financiamiento-funding"/>
+    <w:bookmarkEnd w:id="29"/>
+    <w:bookmarkStart w:id="30" w:name="c.-financiamiento-funding"/>
     <w:p>
       <w:pPr>
         <w:pStyle w:val="Heading3"/>
@@ -1554,8 +1608,8 @@
         <w:t xml:space="preserve">Esta investigación fue realizada como un desarrollo de investigación independiente y de acceso abierto autofinanciado por el autor. No se recibieron subvenciones específicas de organismos del sector público, comercial o sin fines de lucro.</w:t>
       </w:r>
     </w:p>
-    <w:bookmarkEnd w:id="28"/>
-    <w:bookmarkStart w:id="29" w:name="Xae657ab1a92bd8f09f57de06fc35a8d594aaeca"/>
+    <w:bookmarkEnd w:id="30"/>
+    <w:bookmarkStart w:id="31" w:name="Xae657ab1a92bd8f09f57de06fc35a8d594aaeca"/>
     <w:p>
       <w:pPr>
         <w:pStyle w:val="Heading3"/>
@@ -1572,8 +1626,8 @@
         <w:t xml:space="preserve">El autor declara que no existen conflictos de interés financieros, institucionales ni personales que hayan podido influir en el diseño, análisis, interpretación o presentación de los resultados expuestos en este manuscrito.</w:t>
       </w:r>
     </w:p>
-    <w:bookmarkEnd w:id="29"/>
-    <w:bookmarkStart w:id="30" w:name="X165867c682dba5cbdd9d30e774da206830c2fdb"/>
+    <w:bookmarkEnd w:id="31"/>
+    <w:bookmarkStart w:id="32" w:name="X165867c682dba5cbdd9d30e774da206830c2fdb"/>
     <w:p>
       <w:pPr>
         <w:pStyle w:val="Heading3"/>
@@ -1604,8 +1658,8 @@
         <w:t xml:space="preserve">Conceptualización, Metodología, Software, Validación, Análisis Formal, Investigación, Recursos, Curación de Datos, Redacción - Borrador Original, Redacción - Revisión y Edición, Visualización, Supervisión y Administración del Proyecto.</w:t>
       </w:r>
     </w:p>
-    <w:bookmarkEnd w:id="30"/>
-    <w:bookmarkEnd w:id="31"/>
+    <w:bookmarkEnd w:id="32"/>
+    <w:bookmarkEnd w:id="33"/>
     <w:sectPr>
       <w:footnotePr>
         <w:numRestart w:val="eachSect"/>

</xml_diff>